<commit_message>
R2.8: columnas HSS 10x10x1/2 en el peso propio y W = 17.49 t en sismo; documentos de parámetros y densidad basados en las hojas
Co-Authored-By: Claude Opus 5.5 <noreply@anthropic.com>
Claude-Session: https://claude.ai/code/session_01Ns7QgNzAi3QoiHRE1oS8iD
</commit_message>
<xml_diff>
--- a/EDE-HANGAR_NOSE_DOCK_H5_H6_R2.8.docx
+++ b/EDE-HANGAR_NOSE_DOCK_H5_H6_R2.8.docx
@@ -182,7 +182,7 @@
                 <w:sz w:val="20"/>
                 <w:szCs w:val="20"/>
               </w:rPr>
-              <w:t xml:space="preserve">Nave de acero de un agua: columnas HSS 10x10x1/2", vigas de marco y de alero de monten en cajón y largueros de monten</w:t>
+              <w:t xml:space="preserve">Nave de un agua de marcos rígidos ordinarios de acero (NTDS Tabla 7, sistema A3): columnas HSS 10x10x1/2" y vigas de monten en cajón</w:t>
             </w:r>
           </w:p>
         </w:tc>
@@ -690,7 +690,7 @@
                 <w:sz w:val="18"/>
                 <w:szCs w:val="18"/>
               </w:rPr>
-              <w:t xml:space="preserve">Panel sándwich GLAMET PUR/PIR de 1-1/2" (techo)</w:t>
+              <w:t xml:space="preserve">Panel sándwich GLAMET (Metecno) PUR/PIR 1.5" — techo</w:t>
             </w:r>
           </w:p>
         </w:tc>
@@ -746,7 +746,7 @@
                 <w:sz w:val="18"/>
                 <w:szCs w:val="18"/>
               </w:rPr>
-              <w:t xml:space="preserve">Instalaciones generales (iluminación, datos, etc.)</w:t>
+              <w:t xml:space="preserve">Instalaciones generales (iluminación, datos) — techo</w:t>
             </w:r>
           </w:p>
         </w:tc>
@@ -802,7 +802,7 @@
                 <w:sz w:val="18"/>
                 <w:szCs w:val="18"/>
               </w:rPr>
-              <w:t xml:space="preserve">Lámina SSR KR-18 acanalada cal. 24 (muros)</w:t>
+              <w:t xml:space="preserve">Lámina SSR KR-18 acanalada cal. 24 — muros</w:t>
             </w:r>
           </w:p>
         </w:tc>
@@ -923,32 +923,7 @@
           <w:sz w:val="18"/>
           <w:szCs w:val="18"/>
         </w:rPr>
-        <w:t xml:space="preserve">Se considera el peso de la cortina metálica del vano (12 </w:t>
-      </w:r>
-      <w:r>
-        <w:rPr>
-          <w:rFonts w:ascii="Arial" w:hAnsi="Arial" w:cs="Arial"/>
-          <w:sz w:val="18"/>
-          <w:szCs w:val="18"/>
-        </w:rPr>
-        <w:t xml:space="preserve">kg/m</w:t>
-      </w:r>
-      <w:r>
-        <w:rPr>
-          <w:rFonts w:ascii="Arial" w:hAnsi="Arial" w:cs="Arial"/>
-          <w:sz w:val="18"/>
-          <w:szCs w:val="18"/>
-          <w:vertAlign w:val="superscript"/>
-        </w:rPr>
-        <w:t xml:space="preserve">2</w:t>
-      </w:r>
-      <w:r>
-        <w:rPr>
-          <w:rFonts w:ascii="Arial" w:hAnsi="Arial" w:cs="Arial"/>
-          <w:sz w:val="18"/>
-          <w:szCs w:val="18"/>
-        </w:rPr>
-        <w:t xml:space="preserve"> × 5.10 m × 6.50 m = 397.8 kg) como carga lineal de 78 kg/m sobre el dintel. El peso propio de la estructura lo calcula STAAD.Pro.</w:t>
+        <w:t xml:space="preserve">Se considera el peso de la cortina metálica del vano (12 kg/m² × 5.10 m × 6.50 m = 397.8 kg) como carga lineal de 78 kg/m sobre el dintel. El peso propio de la estructura lo calcula STAAD.Pro.</w:t>
       </w:r>
     </w:p>
     <w:p>
@@ -1613,7 +1588,7 @@
                 <w:sz w:val="20"/>
                 <w:szCs w:val="20"/>
               </w:rPr>
-              <w:t xml:space="preserve">h.   Sistema estructural (Tabla 7)</w:t>
+              <w:t xml:space="preserve">h.   Tipo de estructura / sistema (Tabla 7)</w:t>
             </w:r>
           </w:p>
         </w:tc>
@@ -1632,7 +1607,7 @@
                 <w:sz w:val="20"/>
                 <w:szCs w:val="20"/>
               </w:rPr>
-              <w:t xml:space="preserve">A3 — marcos de acero con detallado ordinario</w:t>
+              <w:t xml:space="preserve">Marco rígido ordinario — A3</w:t>
             </w:r>
           </w:p>
         </w:tc>
@@ -1828,7 +1803,7 @@
                 <w:sz w:val="20"/>
                 <w:szCs w:val="20"/>
               </w:rPr>
-              <w:t xml:space="preserve">m.   Coeficiente sísmico estático   Cs</w:t>
+              <w:t xml:space="preserve">m.   Periodo aproximado, Método A   T = Ct·hn^(3/4)</w:t>
             </w:r>
           </w:p>
         </w:tc>
@@ -1847,7 +1822,136 @@
                 <w:sz w:val="20"/>
                 <w:szCs w:val="20"/>
               </w:rPr>
+              <w:t xml:space="preserve">0.48 s</w:t>
+            </w:r>
+          </w:p>
+        </w:tc>
+      </w:tr>
+      <w:tr>
+        <w:trPr>
+          <w:cantSplit/>
+        </w:trPr>
+        <w:tc>
+          <w:tcPr>
+            <w:tcW w:w="6379" w:type="dxa"/>
+            <w:vAlign w:val="center"/>
+          </w:tcPr>
+          <w:p>
+            <w:pPr>
+              <w:spacing w:before="15" w:after="15" w:line="240" w:lineRule="auto"/>
+            </w:pPr>
+            <w:r>
+              <w:rPr>
+                <w:rFonts w:ascii="Arial" w:hAnsi="Arial" w:cs="Arial"/>
+                <w:sz w:val="20"/>
+                <w:szCs w:val="20"/>
+              </w:rPr>
+              <w:t xml:space="preserve">n.   Coeficiente sísmico estático   Cs</w:t>
+            </w:r>
+          </w:p>
+        </w:tc>
+        <w:tc>
+          <w:tcPr>
+            <w:tcW w:w="4395" w:type="dxa"/>
+            <w:vAlign w:val="center"/>
+          </w:tcPr>
+          <w:p>
+            <w:pPr>
+              <w:spacing w:before="15" w:after="15" w:line="240" w:lineRule="auto"/>
+            </w:pPr>
+            <w:r>
+              <w:rPr>
+                <w:rFonts w:ascii="Arial" w:hAnsi="Arial" w:cs="Arial"/>
+                <w:sz w:val="20"/>
+                <w:szCs w:val="20"/>
+              </w:rPr>
               <w:t xml:space="preserve">0.206</w:t>
+            </w:r>
+          </w:p>
+        </w:tc>
+      </w:tr>
+      <w:tr>
+        <w:trPr>
+          <w:cantSplit/>
+        </w:trPr>
+        <w:tc>
+          <w:tcPr>
+            <w:tcW w:w="6379" w:type="dxa"/>
+            <w:vAlign w:val="center"/>
+          </w:tcPr>
+          <w:p>
+            <w:pPr>
+              <w:spacing w:before="15" w:after="15" w:line="240" w:lineRule="auto"/>
+            </w:pPr>
+            <w:r>
+              <w:rPr>
+                <w:rFonts w:ascii="Arial" w:hAnsi="Arial" w:cs="Arial"/>
+                <w:sz w:val="20"/>
+                <w:szCs w:val="20"/>
+              </w:rPr>
+              <w:t xml:space="preserve">o.   Peso sísmico   W = CM + wi</w:t>
+            </w:r>
+          </w:p>
+        </w:tc>
+        <w:tc>
+          <w:tcPr>
+            <w:tcW w:w="4395" w:type="dxa"/>
+            <w:vAlign w:val="center"/>
+          </w:tcPr>
+          <w:p>
+            <w:pPr>
+              <w:spacing w:before="15" w:after="15" w:line="240" w:lineRule="auto"/>
+            </w:pPr>
+            <w:r>
+              <w:rPr>
+                <w:rFonts w:ascii="Arial" w:hAnsi="Arial" w:cs="Arial"/>
+                <w:sz w:val="20"/>
+                <w:szCs w:val="20"/>
+              </w:rPr>
+              <w:t xml:space="preserve">17.49 t</w:t>
+            </w:r>
+          </w:p>
+        </w:tc>
+      </w:tr>
+      <w:tr>
+        <w:trPr>
+          <w:cantSplit/>
+        </w:trPr>
+        <w:tc>
+          <w:tcPr>
+            <w:tcW w:w="6379" w:type="dxa"/>
+            <w:vAlign w:val="center"/>
+          </w:tcPr>
+          <w:p>
+            <w:pPr>
+              <w:spacing w:before="15" w:after="15" w:line="240" w:lineRule="auto"/>
+            </w:pPr>
+            <w:r>
+              <w:rPr>
+                <w:rFonts w:ascii="Arial" w:hAnsi="Arial" w:cs="Arial"/>
+                <w:sz w:val="20"/>
+                <w:szCs w:val="20"/>
+              </w:rPr>
+              <w:t xml:space="preserve">p.   Cortante basal estático   V = Cs·W</w:t>
+            </w:r>
+          </w:p>
+        </w:tc>
+        <w:tc>
+          <w:tcPr>
+            <w:tcW w:w="4395" w:type="dxa"/>
+            <w:vAlign w:val="center"/>
+          </w:tcPr>
+          <w:p>
+            <w:pPr>
+              <w:spacing w:before="15" w:after="15" w:line="240" w:lineRule="auto"/>
+            </w:pPr>
+            <w:r>
+              <w:rPr>
+                <w:rFonts w:ascii="Arial" w:hAnsi="Arial" w:cs="Arial"/>
+                <w:sz w:val="20"/>
+                <w:szCs w:val="20"/>
+              </w:rPr>
+              <w:t xml:space="preserve">3.60 t</w:t>
             </w:r>
           </w:p>
         </w:tc>
@@ -2222,7 +2326,7 @@
       <w:r>
         <w:drawing>
           <wp:inline distT="0" distB="0" distL="0" distR="0">
-            <wp:extent cx="5580000" cy="3138750"/>
+            <wp:extent cx="5580000" cy="2964375"/>
             <wp:docPr id="901" name="Imagen 901"/>
             <wp:cNvGraphicFramePr>
               <a:graphicFrameLocks xmlns:a="http://schemas.openxmlformats.org/drawingml/2006/main" noChangeAspect="1"/>
@@ -2243,7 +2347,7 @@
                   <pic:spPr>
                     <a:xfrm>
                       <a:off x="0" y="0"/>
-                      <a:ext cx="5580000" cy="3138750"/>
+                      <a:ext cx="5580000" cy="2964375"/>
                     </a:xfrm>
                     <a:prstGeom prst="rect">
                       <a:avLst/>
@@ -2254,6 +2358,21 @@
             </a:graphic>
           </wp:inline>
         </w:drawing>
+      </w:r>
+    </w:p>
+    <w:p>
+      <w:pPr>
+        <w:spacing w:before="60" w:after="60" w:line="240" w:lineRule="auto"/>
+        <w:ind w:left="567" w:right="400"/>
+        <w:jc w:val="both"/>
+      </w:pPr>
+      <w:r>
+        <w:rPr>
+          <w:rFonts w:ascii="Arial" w:hAnsi="Arial" w:cs="Arial"/>
+          <w:sz w:val="18"/>
+          <w:szCs w:val="18"/>
+        </w:rPr>
+        <w:t xml:space="preserve">El espectro que se captura en STAAD.Pro es el elástico (R = 1, meseta I·A·Co = 1.44 g) con SCALE = g / R = 980.665 / 7 = 140.095 cm/s², de modo que el análisis modal trabaja con el espectro reducido de la gráfica (meseta 1.44 / 7 = 0.206 g).</w:t>
       </w:r>
     </w:p>
     <w:p>
@@ -2351,7 +2470,7 @@
     </w:p>
     <w:tbl>
       <w:tblPr>
-        <w:tblW w:w="7800" w:type="dxa"/>
+        <w:tblW w:w="8000" w:type="dxa"/>
         <w:jc w:val="center"/>
         <w:tblBorders>
           <w:top w:val="single" w:sz="8" w:space="0" w:color="000000"/>
@@ -2369,8 +2488,8 @@
         <w:tblLook w:val="04A0"/>
       </w:tblPr>
       <w:tblGrid>
-        <w:gridCol w:w="2900"/>
-        <w:gridCol w:w="2300"/>
+        <w:gridCol w:w="3500"/>
+        <w:gridCol w:w="1900"/>
         <w:gridCol w:w="1300"/>
         <w:gridCol w:w="1300"/>
       </w:tblGrid>
@@ -2380,7 +2499,7 @@
         </w:trPr>
         <w:tc>
           <w:tcPr>
-            <w:tcW w:w="7800" w:type="dxa"/>
+            <w:tcW w:w="8000" w:type="dxa"/>
             <w:gridSpan w:val="4"/>
             <w:vAlign w:val="center"/>
           </w:tcPr>
@@ -2408,7 +2527,7 @@
         </w:trPr>
         <w:tc>
           <w:tcPr>
-            <w:tcW w:w="7800" w:type="dxa"/>
+            <w:tcW w:w="8000" w:type="dxa"/>
             <w:gridSpan w:val="4"/>
             <w:shd w:val="clear" w:color="auto" w:fill="D8E4BC"/>
             <w:vAlign w:val="center"/>
@@ -2437,7 +2556,7 @@
         </w:trPr>
         <w:tc>
           <w:tcPr>
-            <w:tcW w:w="2900" w:type="dxa"/>
+            <w:tcW w:w="3500" w:type="dxa"/>
             <w:vAlign w:val="center"/>
           </w:tcPr>
           <w:p>
@@ -2458,7 +2577,7 @@
         </w:tc>
         <w:tc>
           <w:tcPr>
-            <w:tcW w:w="2300" w:type="dxa"/>
+            <w:tcW w:w="1900" w:type="dxa"/>
             <w:vAlign w:val="center"/>
           </w:tcPr>
           <w:p>
@@ -2528,7 +2647,7 @@
         </w:trPr>
         <w:tc>
           <w:tcPr>
-            <w:tcW w:w="2900" w:type="dxa"/>
+            <w:tcW w:w="3500" w:type="dxa"/>
             <w:vAlign w:val="center"/>
           </w:tcPr>
           <w:p>
@@ -2541,13 +2660,13 @@
                 <w:sz w:val="18"/>
                 <w:szCs w:val="18"/>
               </w:rPr>
-              <w:t xml:space="preserve">HSS 10x10x1/2"</w:t>
-            </w:r>
-          </w:p>
-        </w:tc>
-        <w:tc>
-          <w:tcPr>
-            <w:tcW w:w="2300" w:type="dxa"/>
+              <w:t xml:space="preserve">HSS 10x10x1/2" (columnas principales)</w:t>
+            </w:r>
+          </w:p>
+        </w:tc>
+        <w:tc>
+          <w:tcPr>
+            <w:tcW w:w="1900" w:type="dxa"/>
             <w:vAlign w:val="center"/>
           </w:tcPr>
           <w:p>
@@ -2560,7 +2679,24 @@
                 <w:sz w:val="18"/>
                 <w:szCs w:val="18"/>
               </w:rPr>
-              <w:t xml:space="preserve">A36</w:t>
+              <w:t xml:space="preserve">Fy = 2,582 kg/c</w:t>
+            </w:r>
+            <w:r>
+              <w:rPr>
+                <w:rFonts w:ascii="Arial" w:hAnsi="Arial" w:cs="Arial"/>
+                <w:sz w:val="18"/>
+                <w:szCs w:val="18"/>
+              </w:rPr>
+              <w:t xml:space="preserve">m</w:t>
+            </w:r>
+            <w:r>
+              <w:rPr>
+                <w:rFonts w:ascii="Arial" w:hAnsi="Arial" w:cs="Arial"/>
+                <w:sz w:val="18"/>
+                <w:szCs w:val="18"/>
+                <w:vertAlign w:val="superscript"/>
+              </w:rPr>
+              <w:t xml:space="preserve">2</w:t>
             </w:r>
           </w:p>
         </w:tc>
@@ -2611,7 +2747,7 @@
         </w:trPr>
         <w:tc>
           <w:tcPr>
-            <w:tcW w:w="2900" w:type="dxa"/>
+            <w:tcW w:w="3500" w:type="dxa"/>
             <w:vAlign w:val="center"/>
           </w:tcPr>
           <w:p>
@@ -2624,13 +2760,13 @@
                 <w:sz w:val="18"/>
                 <w:szCs w:val="18"/>
               </w:rPr>
-              <w:t xml:space="preserve">HSS 5x5x1/4" (jambas)</w:t>
-            </w:r>
-          </w:p>
-        </w:tc>
-        <w:tc>
-          <w:tcPr>
-            <w:tcW w:w="2300" w:type="dxa"/>
+              <w:t xml:space="preserve">HSS 5x5x1/4" (jambas de cortina)</w:t>
+            </w:r>
+          </w:p>
+        </w:tc>
+        <w:tc>
+          <w:tcPr>
+            <w:tcW w:w="1900" w:type="dxa"/>
             <w:vAlign w:val="center"/>
           </w:tcPr>
           <w:p>
@@ -2643,7 +2779,24 @@
                 <w:sz w:val="18"/>
                 <w:szCs w:val="18"/>
               </w:rPr>
-              <w:t xml:space="preserve">A36</w:t>
+              <w:t xml:space="preserve">Fy = 2,582 kg/c</w:t>
+            </w:r>
+            <w:r>
+              <w:rPr>
+                <w:rFonts w:ascii="Arial" w:hAnsi="Arial" w:cs="Arial"/>
+                <w:sz w:val="18"/>
+                <w:szCs w:val="18"/>
+              </w:rPr>
+              <w:t xml:space="preserve">m</w:t>
+            </w:r>
+            <w:r>
+              <w:rPr>
+                <w:rFonts w:ascii="Arial" w:hAnsi="Arial" w:cs="Arial"/>
+                <w:sz w:val="18"/>
+                <w:szCs w:val="18"/>
+                <w:vertAlign w:val="superscript"/>
+              </w:rPr>
+              <w:t xml:space="preserve">2</w:t>
             </w:r>
           </w:p>
         </w:tc>
@@ -2694,7 +2847,7 @@
         </w:trPr>
         <w:tc>
           <w:tcPr>
-            <w:tcW w:w="2900" w:type="dxa"/>
+            <w:tcW w:w="3500" w:type="dxa"/>
             <w:vAlign w:val="center"/>
           </w:tcPr>
           <w:p>
@@ -2707,13 +2860,13 @@
                 <w:sz w:val="18"/>
                 <w:szCs w:val="18"/>
               </w:rPr>
-              <w:t xml:space="preserve">HSS 5x5x1/8" (postes)</w:t>
-            </w:r>
-          </w:p>
-        </w:tc>
-        <w:tc>
-          <w:tcPr>
-            <w:tcW w:w="2300" w:type="dxa"/>
+              <w:t xml:space="preserve">HSS 5x5x1/8" (postes de puerta)</w:t>
+            </w:r>
+          </w:p>
+        </w:tc>
+        <w:tc>
+          <w:tcPr>
+            <w:tcW w:w="1900" w:type="dxa"/>
             <w:vAlign w:val="center"/>
           </w:tcPr>
           <w:p>
@@ -2726,7 +2879,24 @@
                 <w:sz w:val="18"/>
                 <w:szCs w:val="18"/>
               </w:rPr>
-              <w:t xml:space="preserve">A36</w:t>
+              <w:t xml:space="preserve">Fy = 2,582 kg/c</w:t>
+            </w:r>
+            <w:r>
+              <w:rPr>
+                <w:rFonts w:ascii="Arial" w:hAnsi="Arial" w:cs="Arial"/>
+                <w:sz w:val="18"/>
+                <w:szCs w:val="18"/>
+              </w:rPr>
+              <w:t xml:space="preserve">m</w:t>
+            </w:r>
+            <w:r>
+              <w:rPr>
+                <w:rFonts w:ascii="Arial" w:hAnsi="Arial" w:cs="Arial"/>
+                <w:sz w:val="18"/>
+                <w:szCs w:val="18"/>
+                <w:vertAlign w:val="superscript"/>
+              </w:rPr>
+              <w:t xml:space="preserve">2</w:t>
             </w:r>
           </w:p>
         </w:tc>
@@ -2777,7 +2947,7 @@
         </w:trPr>
         <w:tc>
           <w:tcPr>
-            <w:tcW w:w="5200" w:type="dxa"/>
+            <w:tcW w:w="5400" w:type="dxa"/>
             <w:gridSpan w:val="2"/>
             <w:vAlign w:val="center"/>
           </w:tcPr>
@@ -2843,7 +3013,7 @@
         </w:trPr>
         <w:tc>
           <w:tcPr>
-            <w:tcW w:w="5200" w:type="dxa"/>
+            <w:tcW w:w="5400" w:type="dxa"/>
             <w:gridSpan w:val="2"/>
             <w:vAlign w:val="center"/>
           </w:tcPr>
@@ -2912,7 +3082,7 @@
         </w:trPr>
         <w:tc>
           <w:tcPr>
-            <w:tcW w:w="7800" w:type="dxa"/>
+            <w:tcW w:w="8000" w:type="dxa"/>
             <w:gridSpan w:val="4"/>
             <w:shd w:val="clear" w:color="auto" w:fill="D8E4BC"/>
             <w:vAlign w:val="center"/>
@@ -2941,7 +3111,7 @@
         </w:trPr>
         <w:tc>
           <w:tcPr>
-            <w:tcW w:w="2900" w:type="dxa"/>
+            <w:tcW w:w="3500" w:type="dxa"/>
             <w:vAlign w:val="center"/>
           </w:tcPr>
           <w:p>
@@ -2962,7 +3132,7 @@
         </w:tc>
         <w:tc>
           <w:tcPr>
-            <w:tcW w:w="2300" w:type="dxa"/>
+            <w:tcW w:w="1900" w:type="dxa"/>
             <w:vAlign w:val="center"/>
           </w:tcPr>
           <w:p>
@@ -3032,7 +3202,7 @@
         </w:trPr>
         <w:tc>
           <w:tcPr>
-            <w:tcW w:w="2900" w:type="dxa"/>
+            <w:tcW w:w="3500" w:type="dxa"/>
             <w:vAlign w:val="center"/>
           </w:tcPr>
           <w:p>
@@ -3045,13 +3215,13 @@
                 <w:sz w:val="18"/>
                 <w:szCs w:val="18"/>
               </w:rPr>
-              <w:t xml:space="preserve">Monten en cajón 12" cal 12</w:t>
-            </w:r>
-          </w:p>
-        </w:tc>
-        <w:tc>
-          <w:tcPr>
-            <w:tcW w:w="2300" w:type="dxa"/>
+              <w:t xml:space="preserve">Monten en cajón 12"x7" cal. 12</w:t>
+            </w:r>
+          </w:p>
+        </w:tc>
+        <w:tc>
+          <w:tcPr>
+            <w:tcW w:w="1900" w:type="dxa"/>
             <w:vAlign w:val="center"/>
           </w:tcPr>
           <w:p>
@@ -3064,7 +3234,24 @@
                 <w:sz w:val="18"/>
                 <w:szCs w:val="18"/>
               </w:rPr>
-              <w:t xml:space="preserve">A653 CS/SS</w:t>
+              <w:t xml:space="preserve">Fy = 2,582 kg/c</w:t>
+            </w:r>
+            <w:r>
+              <w:rPr>
+                <w:rFonts w:ascii="Arial" w:hAnsi="Arial" w:cs="Arial"/>
+                <w:sz w:val="18"/>
+                <w:szCs w:val="18"/>
+              </w:rPr>
+              <w:t xml:space="preserve">m</w:t>
+            </w:r>
+            <w:r>
+              <w:rPr>
+                <w:rFonts w:ascii="Arial" w:hAnsi="Arial" w:cs="Arial"/>
+                <w:sz w:val="18"/>
+                <w:szCs w:val="18"/>
+                <w:vertAlign w:val="superscript"/>
+              </w:rPr>
+              <w:t xml:space="preserve">2</w:t>
             </w:r>
           </w:p>
         </w:tc>
@@ -3115,7 +3302,7 @@
         </w:trPr>
         <w:tc>
           <w:tcPr>
-            <w:tcW w:w="2900" w:type="dxa"/>
+            <w:tcW w:w="3500" w:type="dxa"/>
             <w:vAlign w:val="center"/>
           </w:tcPr>
           <w:p>
@@ -3128,13 +3315,13 @@
                 <w:sz w:val="18"/>
                 <w:szCs w:val="18"/>
               </w:rPr>
-              <w:t xml:space="preserve">Monten "C" 12" cal 14</w:t>
-            </w:r>
-          </w:p>
-        </w:tc>
-        <w:tc>
-          <w:tcPr>
-            <w:tcW w:w="2300" w:type="dxa"/>
+              <w:t xml:space="preserve">Monten sencillo 12" cal. 14</w:t>
+            </w:r>
+          </w:p>
+        </w:tc>
+        <w:tc>
+          <w:tcPr>
+            <w:tcW w:w="1900" w:type="dxa"/>
             <w:vAlign w:val="center"/>
           </w:tcPr>
           <w:p>
@@ -3147,7 +3334,24 @@
                 <w:sz w:val="18"/>
                 <w:szCs w:val="18"/>
               </w:rPr>
-              <w:t xml:space="preserve">A653 CS/SS</w:t>
+              <w:t xml:space="preserve">Fy = 2,582 kg/c</w:t>
+            </w:r>
+            <w:r>
+              <w:rPr>
+                <w:rFonts w:ascii="Arial" w:hAnsi="Arial" w:cs="Arial"/>
+                <w:sz w:val="18"/>
+                <w:szCs w:val="18"/>
+              </w:rPr>
+              <w:t xml:space="preserve">m</w:t>
+            </w:r>
+            <w:r>
+              <w:rPr>
+                <w:rFonts w:ascii="Arial" w:hAnsi="Arial" w:cs="Arial"/>
+                <w:sz w:val="18"/>
+                <w:szCs w:val="18"/>
+                <w:vertAlign w:val="superscript"/>
+              </w:rPr>
+              <w:t xml:space="preserve">2</w:t>
             </w:r>
           </w:p>
         </w:tc>
@@ -3198,7 +3402,7 @@
         </w:trPr>
         <w:tc>
           <w:tcPr>
-            <w:tcW w:w="2900" w:type="dxa"/>
+            <w:tcW w:w="3500" w:type="dxa"/>
             <w:vAlign w:val="center"/>
           </w:tcPr>
           <w:p>
@@ -3211,13 +3415,13 @@
                 <w:sz w:val="18"/>
                 <w:szCs w:val="18"/>
               </w:rPr>
-              <w:t xml:space="preserve">Monten en cajón 10" cal 14</w:t>
-            </w:r>
-          </w:p>
-        </w:tc>
-        <w:tc>
-          <w:tcPr>
-            <w:tcW w:w="2300" w:type="dxa"/>
+              <w:t xml:space="preserve">Monten en cajón 10" cal. 14</w:t>
+            </w:r>
+          </w:p>
+        </w:tc>
+        <w:tc>
+          <w:tcPr>
+            <w:tcW w:w="1900" w:type="dxa"/>
             <w:vAlign w:val="center"/>
           </w:tcPr>
           <w:p>
@@ -3230,7 +3434,24 @@
                 <w:sz w:val="18"/>
                 <w:szCs w:val="18"/>
               </w:rPr>
-              <w:t xml:space="preserve">A653 CS/SS</w:t>
+              <w:t xml:space="preserve">Fy = 2,582 kg/c</w:t>
+            </w:r>
+            <w:r>
+              <w:rPr>
+                <w:rFonts w:ascii="Arial" w:hAnsi="Arial" w:cs="Arial"/>
+                <w:sz w:val="18"/>
+                <w:szCs w:val="18"/>
+              </w:rPr>
+              <w:t xml:space="preserve">m</w:t>
+            </w:r>
+            <w:r>
+              <w:rPr>
+                <w:rFonts w:ascii="Arial" w:hAnsi="Arial" w:cs="Arial"/>
+                <w:sz w:val="18"/>
+                <w:szCs w:val="18"/>
+                <w:vertAlign w:val="superscript"/>
+              </w:rPr>
+              <w:t xml:space="preserve">2</w:t>
             </w:r>
           </w:p>
         </w:tc>
@@ -3281,7 +3502,7 @@
         </w:trPr>
         <w:tc>
           <w:tcPr>
-            <w:tcW w:w="2900" w:type="dxa"/>
+            <w:tcW w:w="3500" w:type="dxa"/>
             <w:vAlign w:val="center"/>
           </w:tcPr>
           <w:p>
@@ -3294,13 +3515,13 @@
                 <w:sz w:val="18"/>
                 <w:szCs w:val="18"/>
               </w:rPr>
-              <w:t xml:space="preserve">Tubo PIPX7 (contraflambeo)</w:t>
-            </w:r>
-          </w:p>
-        </w:tc>
-        <w:tc>
-          <w:tcPr>
-            <w:tcW w:w="2300" w:type="dxa"/>
+              <w:t xml:space="preserve">Tubo PIPX7 (contraflambeos)</w:t>
+            </w:r>
+          </w:p>
+        </w:tc>
+        <w:tc>
+          <w:tcPr>
+            <w:tcW w:w="1900" w:type="dxa"/>
             <w:vAlign w:val="center"/>
           </w:tcPr>
           <w:p>
@@ -3313,7 +3534,24 @@
                 <w:sz w:val="18"/>
                 <w:szCs w:val="18"/>
               </w:rPr>
-              <w:t xml:space="preserve">A36</w:t>
+              <w:t xml:space="preserve">Fy = 2,582 kg/c</w:t>
+            </w:r>
+            <w:r>
+              <w:rPr>
+                <w:rFonts w:ascii="Arial" w:hAnsi="Arial" w:cs="Arial"/>
+                <w:sz w:val="18"/>
+                <w:szCs w:val="18"/>
+              </w:rPr>
+              <w:t xml:space="preserve">m</w:t>
+            </w:r>
+            <w:r>
+              <w:rPr>
+                <w:rFonts w:ascii="Arial" w:hAnsi="Arial" w:cs="Arial"/>
+                <w:sz w:val="18"/>
+                <w:szCs w:val="18"/>
+                <w:vertAlign w:val="superscript"/>
+              </w:rPr>
+              <w:t xml:space="preserve">2</w:t>
             </w:r>
           </w:p>
         </w:tc>
@@ -3364,7 +3602,7 @@
         </w:trPr>
         <w:tc>
           <w:tcPr>
-            <w:tcW w:w="5200" w:type="dxa"/>
+            <w:tcW w:w="5400" w:type="dxa"/>
             <w:gridSpan w:val="2"/>
             <w:vAlign w:val="center"/>
           </w:tcPr>
@@ -3430,7 +3668,7 @@
         </w:trPr>
         <w:tc>
           <w:tcPr>
-            <w:tcW w:w="5200" w:type="dxa"/>
+            <w:tcW w:w="5400" w:type="dxa"/>
             <w:gridSpan w:val="2"/>
             <w:vAlign w:val="center"/>
           </w:tcPr>
@@ -3499,7 +3737,7 @@
         </w:trPr>
         <w:tc>
           <w:tcPr>
-            <w:tcW w:w="7800" w:type="dxa"/>
+            <w:tcW w:w="8000" w:type="dxa"/>
             <w:gridSpan w:val="4"/>
             <w:vAlign w:val="center"/>
           </w:tcPr>
@@ -3516,7 +3754,7 @@
         </w:trPr>
         <w:tc>
           <w:tcPr>
-            <w:tcW w:w="5200" w:type="dxa"/>
+            <w:tcW w:w="5400" w:type="dxa"/>
             <w:gridSpan w:val="2"/>
             <w:vAlign w:val="center"/>
           </w:tcPr>
@@ -3565,7 +3803,7 @@
         </w:trPr>
         <w:tc>
           <w:tcPr>
-            <w:tcW w:w="5200" w:type="dxa"/>
+            <w:tcW w:w="5400" w:type="dxa"/>
             <w:gridSpan w:val="2"/>
             <w:vAlign w:val="center"/>
           </w:tcPr>
@@ -3636,8 +3874,18 @@
     </w:tbl>
     <w:p>
       <w:pPr>
-        <w:spacing w:before="0" w:after="0" w:line="240" w:lineRule="auto"/>
-      </w:pPr>
+        <w:spacing w:before="60" w:after="60" w:line="240" w:lineRule="auto"/>
+        <w:ind w:left="1000" w:right="400"/>
+        <w:jc w:val="both"/>
+      </w:pPr>
+      <w:r>
+        <w:rPr>
+          <w:rFonts w:ascii="Arial" w:hAnsi="Arial" w:cs="Arial"/>
+          <w:sz w:val="18"/>
+          <w:szCs w:val="18"/>
+        </w:rPr>
+        <w:t xml:space="preserve">Pesos de la hoja Peso_Estructura_NOSE_DOCK_H5_H6_R2.8.xlsx con las longitudes del modelo 001_NOSE_DOCK_H5_H6_R2.8.STD (0% adicional por conexiones). Acero del modelo: Fy = 2,582 kg/cm², densidad 7,833 kg/m³.</w:t>
+      </w:r>
     </w:p>
     <w:sectPr>
       <w:headerReference w:type="default" r:id="rId12"/>

</xml_diff>